<commit_message>
fix: clarify HQIP clinical audit guide as technique reference only (PSQ5)
The HQIP (NHS) clinical audit guide was cited 6 times as the only
methodology source, with no indication it was optional. Added a note
after the first occurrence clarifying NABH does not mandate this guide
or body - the requirement is NABH PSQ.5 itself, satisfiable by any
equivalent structured audit cycle.

Co-Authored-By: Claude Sonnet 5 <noreply@anthropic.com>
Claude-Session: https://claude.ai/code/session_01TPRLtLhmTCP5z94Q3FiE5v
</commit_message>
<xml_diff>
--- a/policies/build/chapters_v2/PSQ/document/PSQ_Package_v2/PSQ5/SOP_PSQ5_clinical_audit.docx
+++ b/policies/build/chapters_v2/PSQ/document/PSQ_Package_v2/PSQ5/SOP_PSQ5_clinical_audit.docx
@@ -321,42 +321,27 @@
     </w:p>
     <w:p>
       <w:r>
-        <w:t xml:space="preserve">Quality Coordinator: </w:t>
-      </w:r>
-      <w:r>
-        <w:t>leads day-to-day work on this policy and owns the required records.</w:t>
+        <w:t xml:space="preserve">Quality Coordinator: leads day-to-day work on this policy and owns the required records.</w:t>
       </w:r>
     </w:p>
     <w:p>
       <w:r>
-        <w:t xml:space="preserve">Safety/Quality Committee: </w:t>
-      </w:r>
-      <w:r>
-        <w:t>reviews progress on this policy at least monthly and signs off the annual review.</w:t>
+        <w:t xml:space="preserve">Safety/Quality Committee: reviews progress on this policy at least monthly and signs off the annual review.</w:t>
       </w:r>
     </w:p>
     <w:p>
       <w:r>
-        <w:t xml:space="preserve">Department Heads: </w:t>
-      </w:r>
-      <w:r>
-        <w:t>carry out the parts of this policy that apply within their own department.</w:t>
+        <w:t xml:space="preserve">Department Heads: carry out the parts of this policy that apply within their own department.</w:t>
       </w:r>
     </w:p>
     <w:p>
       <w:r>
-        <w:t xml:space="preserve">Medical Superintendent / Governing Body: </w:t>
-      </w:r>
-      <w:r>
-        <w:t>provides resources and reviews outcomes reported to them.</w:t>
+        <w:t xml:space="preserve">Medical Superintendent / Governing Body: provides resources and reviews outcomes reported to them.</w:t>
       </w:r>
     </w:p>
     <w:p>
       <w:r>
-        <w:t xml:space="preserve">All staff in scope: </w:t>
-      </w:r>
-      <w:r>
-        <w:t>follow the steps below and raise any Stop-Work concern immediately, without waiting for permission.</w:t>
+        <w:t xml:space="preserve">All staff in scope: follow the steps below and raise any Stop-Work concern immediately, without waiting for permission.</w:t>
       </w:r>
     </w:p>
     <w:p>
@@ -492,6 +477,14 @@
           <w:t>Healthcare Quality Improvement Partnership. (2021). Clinical audit: A guide for NHS boards and partners.</w:t>
         </w:r>
       </w:hyperlink>
+    </w:p>
+    <w:p>
+      <w:pPr>
+        <w:pStyle w:val="ListParagraph"/>
+      </w:pPr>
+      <w:r>
+        <w:t>Note: this HQIP (NHS) guide is cited for audit methodology/technique only, throughout this SOP. NABH does not mandate this specific guide or body — the requirement to run clinical audits is set by NABH Accreditation Standards for Hospitals, 6th Edition, PSQ.5 itself, which any equivalent structured audit cycle can satisfy.</w:t>
+      </w:r>
     </w:p>
     <w:p>
       <w:pPr>

</xml_diff>